<commit_message>
feat: Enhance schema for Chambers submissions with detailed scoring and evaluation structures
- Added `CategoryScore` and `RubricEvaluation` classes to define scoring criteria for evaluations.
- Introduced `StrategicTaxonomy` for capturing strategic intelligence related to submissions.
- Updated `PMatter` and `NPMatter` schemas to include comprehensive evaluation fields.
- Modified `PublishableMatter` and `ConfidentialMatter` to incorporate strategic intelligence and editorial evaluation metrics.
- Created lightweight extraction schemas (`RawPublishableClient`, `RawConfidentialClient`, etc.) to streamline data handling.
- Implemented RAG context loading functions for Banking & Finance practice area.
- Added a new scoring rubric for Chambers Banking submissions to guide evaluations.
- Updated submission templates to reflect schema changes and ensure accurate data representation.
</commit_message>
<xml_diff>
--- a/templates/USA_Chambers_submission_form_template.docx
+++ b/templates/USA_Chambers_submission_form_template.docx
@@ -7528,9 +7528,9 @@
         <w:tblLook w:val="0000" w:firstRow="0" w:lastRow="0" w:firstColumn="0" w:lastColumn="0" w:noHBand="0" w:noVBand="0"/>
       </w:tblPr>
       <w:tblGrid>
-        <w:gridCol w:w="555"/>
-        <w:gridCol w:w="6750"/>
-        <w:gridCol w:w="2355"/>
+        <w:gridCol w:w="736"/>
+        <w:gridCol w:w="7513"/>
+        <w:gridCol w:w="1411"/>
       </w:tblGrid>
       <w:tr>
         <w:trPr>
@@ -7629,7 +7629,7 @@
         </w:trPr>
         <w:tc>
           <w:tcPr>
-            <w:tcW w:w="555" w:type="dxa"/>
+            <w:tcW w:w="736" w:type="dxa"/>
             <w:tcBorders>
               <w:top w:val="single" w:sz="4" w:space="0" w:color="C0C0C0"/>
               <w:left w:val="single" w:sz="4" w:space="0" w:color="C0C0C0"/>
@@ -7652,7 +7652,7 @@
         </w:tc>
         <w:tc>
           <w:tcPr>
-            <w:tcW w:w="6750" w:type="dxa"/>
+            <w:tcW w:w="7513" w:type="dxa"/>
             <w:tcBorders>
               <w:top w:val="single" w:sz="4" w:space="0" w:color="C0C0C0"/>
               <w:left w:val="single" w:sz="4" w:space="0" w:color="C0C0C0"/>
@@ -7680,7 +7680,7 @@
         </w:tc>
         <w:tc>
           <w:tcPr>
-            <w:tcW w:w="2355" w:type="dxa"/>
+            <w:tcW w:w="1411" w:type="dxa"/>
             <w:tcBorders>
               <w:top w:val="single" w:sz="4" w:space="0" w:color="C0C0C0"/>
               <w:left w:val="single" w:sz="4" w:space="0" w:color="C0C0C0"/>
@@ -7719,7 +7719,7 @@
         </w:trPr>
         <w:tc>
           <w:tcPr>
-            <w:tcW w:w="555" w:type="dxa"/>
+            <w:tcW w:w="736" w:type="dxa"/>
             <w:tcBorders>
               <w:top w:val="single" w:sz="4" w:space="0" w:color="C0C0C0"/>
               <w:left w:val="single" w:sz="4" w:space="0" w:color="C0C0C0"/>
@@ -7750,43 +7750,71 @@
                 <w:b/>
                 <w:bCs/>
               </w:rPr>
-              <w:t>D_publishable_information.D0_publishable_clients_list %}</w:t>
+              <w:t>D_publishable_information</w:t>
             </w:r>
             <w:r>
               <w:rPr>
                 <w:b/>
                 <w:bCs/>
               </w:rPr>
-              <w:t>{{</w:t>
-            </w:r>
-            <w:proofErr w:type="spellStart"/>
+              <w:t>.D0_publishable_clients_list</w:t>
+            </w:r>
             <w:r>
               <w:rPr>
                 <w:b/>
                 <w:bCs/>
               </w:rPr>
-              <w:t>index.loop</w:t>
-            </w:r>
-            <w:proofErr w:type="spellEnd"/>
+              <w:t xml:space="preserve"> %}</w:t>
+            </w:r>
             <w:r>
               <w:rPr>
                 <w:b/>
                 <w:bCs/>
               </w:rPr>
-              <w:t>}}</w:t>
+              <w:t xml:space="preserve"> </w:t>
             </w:r>
             <w:r>
               <w:rPr>
                 <w:b/>
                 <w:bCs/>
               </w:rPr>
+              <w:t>{{</w:t>
+            </w:r>
+            <w:r>
+              <w:rPr>
+                <w:b/>
+                <w:bCs/>
+              </w:rPr>
               <w:t xml:space="preserve"> </w:t>
             </w:r>
-          </w:p>
-        </w:tc>
-        <w:tc>
-          <w:tcPr>
-            <w:tcW w:w="6750" w:type="dxa"/>
+            <w:proofErr w:type="spellStart"/>
+            <w:r>
+              <w:rPr>
+                <w:b/>
+                <w:bCs/>
+              </w:rPr>
+              <w:t>loop.index</w:t>
+            </w:r>
+            <w:proofErr w:type="spellEnd"/>
+            <w:r>
+              <w:rPr>
+                <w:b/>
+                <w:bCs/>
+              </w:rPr>
+              <w:t xml:space="preserve"> </w:t>
+            </w:r>
+            <w:r>
+              <w:rPr>
+                <w:b/>
+                <w:bCs/>
+              </w:rPr>
+              <w:t xml:space="preserve">}} </w:t>
+            </w:r>
+          </w:p>
+        </w:tc>
+        <w:tc>
+          <w:tcPr>
+            <w:tcW w:w="7513" w:type="dxa"/>
             <w:tcBorders>
               <w:top w:val="single" w:sz="4" w:space="0" w:color="C0C0C0"/>
               <w:left w:val="single" w:sz="4" w:space="0" w:color="C0C0C0"/>
@@ -7801,13 +7829,13 @@
               <w:spacing w:line="360" w:lineRule="auto"/>
             </w:pPr>
             <w:r>
-              <w:t xml:space="preserve">{{ </w:t>
-            </w:r>
-            <w:proofErr w:type="spellStart"/>
-            <w:r>
-              <w:t>client.name_of_client</w:t>
-            </w:r>
-            <w:proofErr w:type="spellEnd"/>
+              <w:t>{{ client.</w:t>
+            </w:r>
+            <w:bookmarkStart w:id="4" w:name="_GoBack"/>
+            <w:bookmarkEnd w:id="4"/>
+            <w:r>
+              <w:t>client_name</w:t>
+            </w:r>
             <w:r>
               <w:t xml:space="preserve"> }}</w:t>
             </w:r>
@@ -7815,7 +7843,7 @@
         </w:tc>
         <w:tc>
           <w:tcPr>
-            <w:tcW w:w="2355" w:type="dxa"/>
+            <w:tcW w:w="1411" w:type="dxa"/>
             <w:tcBorders>
               <w:top w:val="single" w:sz="4" w:space="0" w:color="C0C0C0"/>
               <w:left w:val="single" w:sz="4" w:space="0" w:color="C0C0C0"/>
@@ -7859,7 +7887,7 @@
         </w:trPr>
         <w:tc>
           <w:tcPr>
-            <w:tcW w:w="555" w:type="dxa"/>
+            <w:tcW w:w="736" w:type="dxa"/>
             <w:tcBorders>
               <w:top w:val="single" w:sz="4" w:space="0" w:color="C0C0C0"/>
               <w:left w:val="single" w:sz="4" w:space="0" w:color="C0C0C0"/>
@@ -7896,7 +7924,7 @@
         </w:tc>
         <w:tc>
           <w:tcPr>
-            <w:tcW w:w="6750" w:type="dxa"/>
+            <w:tcW w:w="7513" w:type="dxa"/>
             <w:tcBorders>
               <w:top w:val="single" w:sz="4" w:space="0" w:color="C0C0C0"/>
               <w:left w:val="single" w:sz="4" w:space="0" w:color="C0C0C0"/>
@@ -7914,7 +7942,7 @@
         </w:tc>
         <w:tc>
           <w:tcPr>
-            <w:tcW w:w="2355" w:type="dxa"/>
+            <w:tcW w:w="1411" w:type="dxa"/>
             <w:tcBorders>
               <w:top w:val="single" w:sz="4" w:space="0" w:color="C0C0C0"/>
               <w:left w:val="single" w:sz="4" w:space="0" w:color="C0C0C0"/>
@@ -7956,7 +7984,6 @@
           <w:sz w:val="26"/>
           <w:szCs w:val="26"/>
         </w:rPr>
-        <w:lastRenderedPageBreak/>
         <w:t xml:space="preserve">{%p for matter in </w:t>
       </w:r>
       <w:proofErr w:type="spellStart"/>
@@ -9433,19 +9460,32 @@
               <w:snapToGrid w:val="0"/>
               <w:spacing w:line="360" w:lineRule="auto"/>
               <w:jc w:val="center"/>
+            </w:pPr>
+            <w:r>
+              <w:t>{% for client in E_confidential_</w:t>
+            </w:r>
+            <w:proofErr w:type="gramStart"/>
+            <w:r>
+              <w:t>information.E</w:t>
+            </w:r>
+            <w:proofErr w:type="gramEnd"/>
+            <w:r>
+              <w:t>0_confidential_clients_list %}</w:t>
+            </w:r>
+          </w:p>
+          <w:p>
+            <w:pPr>
+              <w:keepNext/>
+              <w:snapToGrid w:val="0"/>
+              <w:spacing w:line="360" w:lineRule="auto"/>
+              <w:jc w:val="center"/>
               <w:rPr>
                 <w:b/>
                 <w:bCs/>
               </w:rPr>
             </w:pPr>
             <w:r>
-              <w:t>{% for client in E_confidential_information.E0_confidential</w:t>
-            </w:r>
-            <w:r>
-              <w:t>_clients_list %}</w:t>
-            </w:r>
-            <w:r>
-              <w:t>{{</w:t>
+              <w:t xml:space="preserve">  {{ </w:t>
             </w:r>
             <w:proofErr w:type="spellStart"/>
             <w:r>
@@ -9453,7 +9493,7 @@
             </w:r>
             <w:proofErr w:type="spellEnd"/>
             <w:r>
-              <w:t>}}</w:t>
+              <w:t xml:space="preserve"> }}</w:t>
             </w:r>
           </w:p>
         </w:tc>
@@ -9478,14 +9518,12 @@
             </w:r>
             <w:proofErr w:type="spellStart"/>
             <w:r>
-              <w:t>client.name_of_client</w:t>
+              <w:t>client.client_name</w:t>
             </w:r>
             <w:proofErr w:type="spellEnd"/>
             <w:r>
               <w:t xml:space="preserve"> }}</w:t>
             </w:r>
-            <w:bookmarkStart w:id="4" w:name="_GoBack"/>
-            <w:bookmarkEnd w:id="4"/>
           </w:p>
         </w:tc>
         <w:tc>
@@ -9530,7 +9568,7 @@
           </w:tblCellMar>
         </w:tblPrEx>
         <w:trPr>
-          <w:trHeight w:val="36"/>
+          <w:trHeight w:val="926"/>
         </w:trPr>
         <w:tc>
           <w:tcPr>
@@ -9550,6 +9588,7 @@
               <w:jc w:val="center"/>
             </w:pPr>
             <w:r>
+              <w:lastRenderedPageBreak/>
               <w:t>{%</w:t>
             </w:r>
             <w:r>
@@ -9633,7 +9672,6 @@
           <w:sz w:val="26"/>
           <w:szCs w:val="26"/>
         </w:rPr>
-        <w:lastRenderedPageBreak/>
         <w:t xml:space="preserve">{%p for matter in </w:t>
       </w:r>
       <w:proofErr w:type="spellStart"/>
@@ -12126,21 +12164,6 @@
 </file>
 
 <file path=customXml/item1.xml><?xml version="1.0" encoding="utf-8"?>
-<?mso-contentType ?>
-<FormTemplates xmlns="http://schemas.microsoft.com/sharepoint/v3/contenttype/forms">
-  <Display>DocumentLibraryForm</Display>
-  <Edit>DocumentLibraryForm</Edit>
-  <New>DocumentLibraryForm</New>
-</FormTemplates>
-</file>
-
-<file path=customXml/item2.xml><?xml version="1.0" encoding="utf-8"?>
-<p:properties xmlns:p="http://schemas.microsoft.com/office/2006/metadata/properties" xmlns:xsi="http://www.w3.org/2001/XMLSchema-instance" xmlns:pc="http://schemas.microsoft.com/office/infopath/2007/PartnerControls">
-  <documentManagement/>
-</p:properties>
-</file>
-
-<file path=customXml/item3.xml><?xml version="1.0" encoding="utf-8"?>
 <ct:contentTypeSchema xmlns:ct="http://schemas.microsoft.com/office/2006/metadata/contentType" xmlns:ma="http://schemas.microsoft.com/office/2006/metadata/properties/metaAttributes" ct:_="" ma:_="" ma:contentTypeName="Document" ma:contentTypeID="0x010100C0A3F699CAC20245A5135D9D45A03EF5" ma:contentTypeVersion="12" ma:contentTypeDescription="Create a new document." ma:contentTypeScope="" ma:versionID="0195056a2cd20f7c2e413a66b9b04655">
   <xsd:schema xmlns:xsd="http://www.w3.org/2001/XMLSchema" xmlns:xs="http://www.w3.org/2001/XMLSchema" xmlns:p="http://schemas.microsoft.com/office/2006/metadata/properties" xmlns:ns2="e0558349-9206-4eef-a884-42c4790c774a" xmlns:ns3="2ba46c64-8df1-4d4c-aac9-81665ca216a1" targetNamespace="http://schemas.microsoft.com/office/2006/metadata/properties" ma:root="true" ma:fieldsID="1819882a62daf12d1dfe2dfd94e71209" ns2:_="" ns3:_="">
     <xsd:import namespace="e0558349-9206-4eef-a884-42c4790c774a"/>
@@ -12357,28 +12380,26 @@
 </ct:contentTypeSchema>
 </file>
 
+<file path=customXml/item2.xml><?xml version="1.0" encoding="utf-8"?>
+<?mso-contentType ?>
+<FormTemplates xmlns="http://schemas.microsoft.com/sharepoint/v3/contenttype/forms">
+  <Display>DocumentLibraryForm</Display>
+  <Edit>DocumentLibraryForm</Edit>
+  <New>DocumentLibraryForm</New>
+</FormTemplates>
+</file>
+
+<file path=customXml/item3.xml><?xml version="1.0" encoding="utf-8"?>
+<p:properties xmlns:p="http://schemas.microsoft.com/office/2006/metadata/properties" xmlns:xsi="http://www.w3.org/2001/XMLSchema-instance" xmlns:pc="http://schemas.microsoft.com/office/infopath/2007/PartnerControls">
+  <documentManagement/>
+</p:properties>
+</file>
+
 <file path=customXml/item4.xml><?xml version="1.0" encoding="utf-8"?>
 <b:Sources xmlns:b="http://schemas.openxmlformats.org/officeDocument/2006/bibliography" xmlns="http://schemas.openxmlformats.org/officeDocument/2006/bibliography" SelectedStyle="/APASixthEditionOfficeOnline.xsl" StyleName="APA" Version="6"/>
 </file>
 
 <file path=customXml/itemProps1.xml><?xml version="1.0" encoding="utf-8"?>
-<ds:datastoreItem xmlns:ds="http://schemas.openxmlformats.org/officeDocument/2006/customXml" ds:itemID="{1E10126D-3C65-403A-8123-F81987A3EED1}">
-  <ds:schemaRefs>
-    <ds:schemaRef ds:uri="http://schemas.microsoft.com/sharepoint/v3/contenttype/forms"/>
-  </ds:schemaRefs>
-</ds:datastoreItem>
-</file>
-
-<file path=customXml/itemProps2.xml><?xml version="1.0" encoding="utf-8"?>
-<ds:datastoreItem xmlns:ds="http://schemas.openxmlformats.org/officeDocument/2006/customXml" ds:itemID="{91CE9077-16D7-4A72-891E-96174505B57E}">
-  <ds:schemaRefs>
-    <ds:schemaRef ds:uri="http://schemas.microsoft.com/office/2006/metadata/properties"/>
-    <ds:schemaRef ds:uri="http://schemas.microsoft.com/office/infopath/2007/PartnerControls"/>
-  </ds:schemaRefs>
-</ds:datastoreItem>
-</file>
-
-<file path=customXml/itemProps3.xml><?xml version="1.0" encoding="utf-8"?>
 <ds:datastoreItem xmlns:ds="http://schemas.openxmlformats.org/officeDocument/2006/customXml" ds:itemID="{0A5F6249-CECB-4F5A-A4C1-A1629BD104DB}">
   <ds:schemaRefs>
     <ds:schemaRef ds:uri="http://schemas.microsoft.com/office/2006/metadata/contentType"/>
@@ -12397,8 +12418,25 @@
 </ds:datastoreItem>
 </file>
 
+<file path=customXml/itemProps2.xml><?xml version="1.0" encoding="utf-8"?>
+<ds:datastoreItem xmlns:ds="http://schemas.openxmlformats.org/officeDocument/2006/customXml" ds:itemID="{1E10126D-3C65-403A-8123-F81987A3EED1}">
+  <ds:schemaRefs>
+    <ds:schemaRef ds:uri="http://schemas.microsoft.com/sharepoint/v3/contenttype/forms"/>
+  </ds:schemaRefs>
+</ds:datastoreItem>
+</file>
+
+<file path=customXml/itemProps3.xml><?xml version="1.0" encoding="utf-8"?>
+<ds:datastoreItem xmlns:ds="http://schemas.openxmlformats.org/officeDocument/2006/customXml" ds:itemID="{91CE9077-16D7-4A72-891E-96174505B57E}">
+  <ds:schemaRefs>
+    <ds:schemaRef ds:uri="http://schemas.microsoft.com/office/2006/metadata/properties"/>
+    <ds:schemaRef ds:uri="http://schemas.microsoft.com/office/infopath/2007/PartnerControls"/>
+  </ds:schemaRefs>
+</ds:datastoreItem>
+</file>
+
 <file path=customXml/itemProps4.xml><?xml version="1.0" encoding="utf-8"?>
-<ds:datastoreItem xmlns:ds="http://schemas.openxmlformats.org/officeDocument/2006/customXml" ds:itemID="{0287418A-1E36-4E3B-AEAA-DC391D22A23C}">
+<ds:datastoreItem xmlns:ds="http://schemas.openxmlformats.org/officeDocument/2006/customXml" ds:itemID="{08812DD7-7D34-47D7-9AC9-41ACC75F790E}">
   <ds:schemaRefs>
     <ds:schemaRef ds:uri="http://schemas.openxmlformats.org/officeDocument/2006/bibliography"/>
   </ds:schemaRefs>

</xml_diff>

<commit_message>
feat: Implement Matters Assistant workflow and optimize single matter submissions
- Added new nodes for Matters Assistant ingestion and extraction in the workflow.
- Introduced a dedicated optimization node for polishing single matter narratives.
- Created a new submission strategy for handling single matter submissions with YAML configuration.
- Enhanced existing agents to support Matters Assistant, including sanitization and classification.
- Implemented a new OCR assist module for extracting text from images.
- Updated schemas to accommodate new data structures for single matter extraction.
- Added templates for generating single matter submissions in DOCX format.
- Improved debugging and logging throughout the process for better traceability.
</commit_message>
<xml_diff>
--- a/templates/USA_Chambers_submission_form_template.docx
+++ b/templates/USA_Chambers_submission_form_template.docx
@@ -7831,8 +7831,6 @@
             <w:r>
               <w:t>{{ client.</w:t>
             </w:r>
-            <w:bookmarkStart w:id="4" w:name="_GoBack"/>
-            <w:bookmarkEnd w:id="4"/>
             <w:r>
               <w:t>client_name</w:t>
             </w:r>
@@ -8784,6 +8782,9 @@
             <w:pPr>
               <w:keepNext/>
               <w:snapToGrid w:val="0"/>
+              <w:rPr>
+                <w:u w:val="single"/>
+              </w:rPr>
             </w:pPr>
             <w:r>
               <w:rPr>
@@ -8840,7 +8841,7 @@
                 <w:sz w:val="22"/>
                 <w:szCs w:val="22"/>
               </w:rPr>
-              <w:t>{{ matter.D7_other_firms }}</w:t>
+              <w:t>{{ matter.D7_other_firms_advising }}</w:t>
             </w:r>
           </w:p>
         </w:tc>
@@ -8933,7 +8934,7 @@
                 <w:sz w:val="22"/>
                 <w:szCs w:val="22"/>
               </w:rPr>
-              <w:t>{{ matter.D8_date_or_status }}</w:t>
+              <w:t>{{ matter.D8_date_completion_or_status }}</w:t>
             </w:r>
           </w:p>
         </w:tc>
@@ -9026,7 +9027,7 @@
                 <w:sz w:val="22"/>
                 <w:szCs w:val="22"/>
               </w:rPr>
-              <w:t>{{ matter.D9_other_info }}</w:t>
+              <w:t>{{ matter.D9_other_information_links }}</w:t>
             </w:r>
           </w:p>
         </w:tc>
@@ -10603,21 +10604,14 @@
                 <w:sz w:val="22"/>
                 <w:szCs w:val="22"/>
               </w:rPr>
-              <w:t>{{ matter.</w:t>
-            </w:r>
-            <w:r>
-              <w:rPr>
-                <w:sz w:val="22"/>
-                <w:szCs w:val="22"/>
-              </w:rPr>
-              <w:t>E</w:t>
-            </w:r>
-            <w:r>
-              <w:rPr>
-                <w:sz w:val="22"/>
-                <w:szCs w:val="22"/>
-              </w:rPr>
-              <w:t>7_other_firms }}</w:t>
+              <w:t>{{ matter.E</w:t>
+            </w:r>
+            <w:r>
+              <w:rPr>
+                <w:sz w:val="22"/>
+                <w:szCs w:val="22"/>
+              </w:rPr>
+              <w:t>7_other_firms_advising }}</w:t>
             </w:r>
           </w:p>
         </w:tc>
@@ -10710,21 +10704,14 @@
                 <w:sz w:val="22"/>
                 <w:szCs w:val="22"/>
               </w:rPr>
-              <w:t>{{ matter.</w:t>
-            </w:r>
-            <w:r>
-              <w:rPr>
-                <w:sz w:val="22"/>
-                <w:szCs w:val="22"/>
-              </w:rPr>
-              <w:t>E</w:t>
-            </w:r>
-            <w:r>
-              <w:rPr>
-                <w:sz w:val="22"/>
-                <w:szCs w:val="22"/>
-              </w:rPr>
-              <w:t>8_date_or_status }}</w:t>
+              <w:t>{{ matter.E</w:t>
+            </w:r>
+            <w:r>
+              <w:rPr>
+                <w:sz w:val="22"/>
+                <w:szCs w:val="22"/>
+              </w:rPr>
+              <w:t>8_date_completion_or_status }}</w:t>
             </w:r>
           </w:p>
         </w:tc>
@@ -10816,21 +10803,16 @@
                 <w:sz w:val="22"/>
                 <w:szCs w:val="22"/>
               </w:rPr>
-              <w:t>{{ matter.</w:t>
-            </w:r>
-            <w:r>
-              <w:rPr>
-                <w:sz w:val="22"/>
-                <w:szCs w:val="22"/>
-              </w:rPr>
-              <w:t>E</w:t>
-            </w:r>
-            <w:r>
-              <w:rPr>
-                <w:sz w:val="22"/>
-                <w:szCs w:val="22"/>
-              </w:rPr>
-              <w:t>9_other_info }}</w:t>
+              <w:t>{{ matter.E</w:t>
+            </w:r>
+            <w:bookmarkStart w:id="4" w:name="_GoBack"/>
+            <w:bookmarkEnd w:id="4"/>
+            <w:r>
+              <w:rPr>
+                <w:sz w:val="22"/>
+                <w:szCs w:val="22"/>
+              </w:rPr>
+              <w:t>9_other_information_links }}</w:t>
             </w:r>
           </w:p>
         </w:tc>
@@ -12164,6 +12146,15 @@
 </file>
 
 <file path=customXml/item1.xml><?xml version="1.0" encoding="utf-8"?>
+<?mso-contentType ?>
+<FormTemplates xmlns="http://schemas.microsoft.com/sharepoint/v3/contenttype/forms">
+  <Display>DocumentLibraryForm</Display>
+  <Edit>DocumentLibraryForm</Edit>
+  <New>DocumentLibraryForm</New>
+</FormTemplates>
+</file>
+
+<file path=customXml/item2.xml><?xml version="1.0" encoding="utf-8"?>
 <ct:contentTypeSchema xmlns:ct="http://schemas.microsoft.com/office/2006/metadata/contentType" xmlns:ma="http://schemas.microsoft.com/office/2006/metadata/properties/metaAttributes" ct:_="" ma:_="" ma:contentTypeName="Document" ma:contentTypeID="0x010100C0A3F699CAC20245A5135D9D45A03EF5" ma:contentTypeVersion="12" ma:contentTypeDescription="Create a new document." ma:contentTypeScope="" ma:versionID="0195056a2cd20f7c2e413a66b9b04655">
   <xsd:schema xmlns:xsd="http://www.w3.org/2001/XMLSchema" xmlns:xs="http://www.w3.org/2001/XMLSchema" xmlns:p="http://schemas.microsoft.com/office/2006/metadata/properties" xmlns:ns2="e0558349-9206-4eef-a884-42c4790c774a" xmlns:ns3="2ba46c64-8df1-4d4c-aac9-81665ca216a1" targetNamespace="http://schemas.microsoft.com/office/2006/metadata/properties" ma:root="true" ma:fieldsID="1819882a62daf12d1dfe2dfd94e71209" ns2:_="" ns3:_="">
     <xsd:import namespace="e0558349-9206-4eef-a884-42c4790c774a"/>
@@ -12380,15 +12371,6 @@
 </ct:contentTypeSchema>
 </file>
 
-<file path=customXml/item2.xml><?xml version="1.0" encoding="utf-8"?>
-<?mso-contentType ?>
-<FormTemplates xmlns="http://schemas.microsoft.com/sharepoint/v3/contenttype/forms">
-  <Display>DocumentLibraryForm</Display>
-  <Edit>DocumentLibraryForm</Edit>
-  <New>DocumentLibraryForm</New>
-</FormTemplates>
-</file>
-
 <file path=customXml/item3.xml><?xml version="1.0" encoding="utf-8"?>
 <p:properties xmlns:p="http://schemas.microsoft.com/office/2006/metadata/properties" xmlns:xsi="http://www.w3.org/2001/XMLSchema-instance" xmlns:pc="http://schemas.microsoft.com/office/infopath/2007/PartnerControls">
   <documentManagement/>
@@ -12400,6 +12382,14 @@
 </file>
 
 <file path=customXml/itemProps1.xml><?xml version="1.0" encoding="utf-8"?>
+<ds:datastoreItem xmlns:ds="http://schemas.openxmlformats.org/officeDocument/2006/customXml" ds:itemID="{1E10126D-3C65-403A-8123-F81987A3EED1}">
+  <ds:schemaRefs>
+    <ds:schemaRef ds:uri="http://schemas.microsoft.com/sharepoint/v3/contenttype/forms"/>
+  </ds:schemaRefs>
+</ds:datastoreItem>
+</file>
+
+<file path=customXml/itemProps2.xml><?xml version="1.0" encoding="utf-8"?>
 <ds:datastoreItem xmlns:ds="http://schemas.openxmlformats.org/officeDocument/2006/customXml" ds:itemID="{0A5F6249-CECB-4F5A-A4C1-A1629BD104DB}">
   <ds:schemaRefs>
     <ds:schemaRef ds:uri="http://schemas.microsoft.com/office/2006/metadata/contentType"/>
@@ -12418,14 +12408,6 @@
 </ds:datastoreItem>
 </file>
 
-<file path=customXml/itemProps2.xml><?xml version="1.0" encoding="utf-8"?>
-<ds:datastoreItem xmlns:ds="http://schemas.openxmlformats.org/officeDocument/2006/customXml" ds:itemID="{1E10126D-3C65-403A-8123-F81987A3EED1}">
-  <ds:schemaRefs>
-    <ds:schemaRef ds:uri="http://schemas.microsoft.com/sharepoint/v3/contenttype/forms"/>
-  </ds:schemaRefs>
-</ds:datastoreItem>
-</file>
-
 <file path=customXml/itemProps3.xml><?xml version="1.0" encoding="utf-8"?>
 <ds:datastoreItem xmlns:ds="http://schemas.openxmlformats.org/officeDocument/2006/customXml" ds:itemID="{91CE9077-16D7-4A72-891E-96174505B57E}">
   <ds:schemaRefs>
@@ -12436,7 +12418,7 @@
 </file>
 
 <file path=customXml/itemProps4.xml><?xml version="1.0" encoding="utf-8"?>
-<ds:datastoreItem xmlns:ds="http://schemas.openxmlformats.org/officeDocument/2006/customXml" ds:itemID="{08812DD7-7D34-47D7-9AC9-41ACC75F790E}">
+<ds:datastoreItem xmlns:ds="http://schemas.openxmlformats.org/officeDocument/2006/customXml" ds:itemID="{2272752C-5B69-49B3-88EB-DB691A129D14}">
   <ds:schemaRefs>
     <ds:schemaRef ds:uri="http://schemas.openxmlformats.org/officeDocument/2006/bibliography"/>
   </ds:schemaRefs>

</xml_diff>